<commit_message>
updated set of questions
</commit_message>
<xml_diff>
--- a/JAVA 8 BASIC CODING.docx
+++ b/JAVA 8 BASIC CODING.docx
@@ -12,14 +12,22 @@
         <w:rPr>
           <w:lang w:val="en-US"/>
         </w:rPr>
-        <w:t xml:space="preserve">JAVA 8 BASIC CODING </w:t>
-      </w:r>
+        <w:t xml:space="preserve">JAVA 8 BASIC </w:t>
+      </w:r>
+      <w:proofErr w:type="gramStart"/>
       <w:r>
         <w:rPr>
           <w:lang w:val="en-US"/>
         </w:rPr>
+        <w:t xml:space="preserve">CODING </w:t>
+      </w:r>
+      <w:r>
+        <w:rPr>
+          <w:lang w:val="en-US"/>
+        </w:rPr>
         <w:t xml:space="preserve"> :</w:t>
       </w:r>
+      <w:proofErr w:type="gramEnd"/>
     </w:p>
     <w:p>
       <w:pPr>
@@ -260,6 +268,62 @@
           <w:b/>
           <w:bCs/>
         </w:rPr>
+        <w:br/>
+      </w:r>
+      <w:r>
+        <w:rPr>
+          <w:b/>
+          <w:bCs/>
+          <w:noProof/>
+        </w:rPr>
+        <w:drawing>
+          <wp:inline distT="0" distB="0" distL="0" distR="0" wp14:anchorId="4CF1E0CC" wp14:editId="55B0A140">
+            <wp:extent cx="5731510" cy="1049655"/>
+            <wp:effectExtent l="0" t="0" r="2540" b="0"/>
+            <wp:docPr id="1051749437" name="Picture 1"/>
+            <wp:cNvGraphicFramePr>
+              <a:graphicFrameLocks xmlns:a="http://schemas.openxmlformats.org/drawingml/2006/main" noChangeAspect="1"/>
+            </wp:cNvGraphicFramePr>
+            <a:graphic xmlns:a="http://schemas.openxmlformats.org/drawingml/2006/main">
+              <a:graphicData uri="http://schemas.openxmlformats.org/drawingml/2006/picture">
+                <pic:pic xmlns:pic="http://schemas.openxmlformats.org/drawingml/2006/picture">
+                  <pic:nvPicPr>
+                    <pic:cNvPr id="1051749437" name=""/>
+                    <pic:cNvPicPr/>
+                  </pic:nvPicPr>
+                  <pic:blipFill>
+                    <a:blip r:embed="rId8"/>
+                    <a:stretch>
+                      <a:fillRect/>
+                    </a:stretch>
+                  </pic:blipFill>
+                  <pic:spPr>
+                    <a:xfrm>
+                      <a:off x="0" y="0"/>
+                      <a:ext cx="5731510" cy="1049655"/>
+                    </a:xfrm>
+                    <a:prstGeom prst="rect">
+                      <a:avLst/>
+                    </a:prstGeom>
+                  </pic:spPr>
+                </pic:pic>
+              </a:graphicData>
+            </a:graphic>
+          </wp:inline>
+        </w:drawing>
+      </w:r>
+      <w:r>
+        <w:rPr>
+          <w:b/>
+          <w:bCs/>
+        </w:rPr>
+        <w:br/>
+      </w:r>
+      <w:r>
+        <w:rPr>
+          <w:b/>
+          <w:bCs/>
+        </w:rPr>
         <w:t xml:space="preserve">4. </w:t>
       </w:r>
       <w:r>
@@ -314,7 +378,7 @@
                     <pic:cNvPicPr/>
                   </pic:nvPicPr>
                   <pic:blipFill>
-                    <a:blip r:embed="rId8"/>
+                    <a:blip r:embed="rId9"/>
                     <a:stretch>
                       <a:fillRect/>
                     </a:stretch>
@@ -376,7 +440,7 @@
                     <pic:cNvPicPr/>
                   </pic:nvPicPr>
                   <pic:blipFill>
-                    <a:blip r:embed="rId9"/>
+                    <a:blip r:embed="rId10"/>
                     <a:stretch>
                       <a:fillRect/>
                     </a:stretch>
@@ -446,7 +510,7 @@
                     <pic:cNvPicPr/>
                   </pic:nvPicPr>
                   <pic:blipFill>
-                    <a:blip r:embed="rId10"/>
+                    <a:blip r:embed="rId11"/>
                     <a:stretch>
                       <a:fillRect/>
                     </a:stretch>
@@ -475,12 +539,21 @@
           <w:bCs/>
         </w:rPr>
       </w:pPr>
-      <w:r>
-        <w:rPr>
-          <w:b/>
-          <w:bCs/>
-        </w:rPr>
-        <w:t xml:space="preserve">7 . </w:t>
+      <w:proofErr w:type="gramStart"/>
+      <w:r>
+        <w:rPr>
+          <w:b/>
+          <w:bCs/>
+        </w:rPr>
+        <w:t>7 .</w:t>
+      </w:r>
+      <w:proofErr w:type="gramEnd"/>
+      <w:r>
+        <w:rPr>
+          <w:b/>
+          <w:bCs/>
+        </w:rPr>
+        <w:t xml:space="preserve"> </w:t>
       </w:r>
       <w:r>
         <w:rPr>
@@ -516,7 +589,7 @@
                     <pic:cNvPicPr/>
                   </pic:nvPicPr>
                   <pic:blipFill>
-                    <a:blip r:embed="rId11"/>
+                    <a:blip r:embed="rId12"/>
                     <a:stretch>
                       <a:fillRect/>
                     </a:stretch>
@@ -597,7 +670,7 @@
                     <pic:cNvPicPr/>
                   </pic:nvPicPr>
                   <pic:blipFill>
-                    <a:blip r:embed="rId12"/>
+                    <a:blip r:embed="rId13"/>
                     <a:stretch>
                       <a:fillRect/>
                     </a:stretch>
@@ -606,6 +679,52 @@
                     <a:xfrm>
                       <a:off x="0" y="0"/>
                       <a:ext cx="5731510" cy="2830195"/>
+                    </a:xfrm>
+                    <a:prstGeom prst="rect">
+                      <a:avLst/>
+                    </a:prstGeom>
+                  </pic:spPr>
+                </pic:pic>
+              </a:graphicData>
+            </a:graphic>
+          </wp:inline>
+        </w:drawing>
+      </w:r>
+      <w:r>
+        <w:br/>
+      </w:r>
+      <w:r>
+        <w:br/>
+      </w:r>
+      <w:r>
+        <w:rPr>
+          <w:noProof/>
+        </w:rPr>
+        <w:drawing>
+          <wp:inline distT="0" distB="0" distL="0" distR="0" wp14:anchorId="32814239" wp14:editId="4C3238BA">
+            <wp:extent cx="5731510" cy="1652905"/>
+            <wp:effectExtent l="0" t="0" r="2540" b="4445"/>
+            <wp:docPr id="1641108589" name="Picture 1"/>
+            <wp:cNvGraphicFramePr>
+              <a:graphicFrameLocks xmlns:a="http://schemas.openxmlformats.org/drawingml/2006/main" noChangeAspect="1"/>
+            </wp:cNvGraphicFramePr>
+            <a:graphic xmlns:a="http://schemas.openxmlformats.org/drawingml/2006/main">
+              <a:graphicData uri="http://schemas.openxmlformats.org/drawingml/2006/picture">
+                <pic:pic xmlns:pic="http://schemas.openxmlformats.org/drawingml/2006/picture">
+                  <pic:nvPicPr>
+                    <pic:cNvPr id="1641108589" name=""/>
+                    <pic:cNvPicPr/>
+                  </pic:nvPicPr>
+                  <pic:blipFill>
+                    <a:blip r:embed="rId14"/>
+                    <a:stretch>
+                      <a:fillRect/>
+                    </a:stretch>
+                  </pic:blipFill>
+                  <pic:spPr>
+                    <a:xfrm>
+                      <a:off x="0" y="0"/>
+                      <a:ext cx="5731510" cy="1652905"/>
                     </a:xfrm>
                     <a:prstGeom prst="rect">
                       <a:avLst/>
@@ -657,7 +776,7 @@
                     <pic:cNvPicPr/>
                   </pic:nvPicPr>
                   <pic:blipFill>
-                    <a:blip r:embed="rId13"/>
+                    <a:blip r:embed="rId15"/>
                     <a:stretch>
                       <a:fillRect/>
                     </a:stretch>
@@ -699,6 +818,7 @@
           <w:bCs/>
           <w:noProof/>
         </w:rPr>
+        <w:lastRenderedPageBreak/>
         <w:drawing>
           <wp:inline distT="0" distB="0" distL="0" distR="0" wp14:anchorId="1CBF3A4D" wp14:editId="5FDA7DBD">
             <wp:extent cx="5731510" cy="1699260"/>
@@ -715,7 +835,7 @@
                     <pic:cNvPicPr/>
                   </pic:nvPicPr>
                   <pic:blipFill>
-                    <a:blip r:embed="rId14"/>
+                    <a:blip r:embed="rId16"/>
                     <a:stretch>
                       <a:fillRect/>
                     </a:stretch>
@@ -753,7 +873,15 @@
         <w:t xml:space="preserve"> </w:t>
       </w:r>
       <w:r>
-        <w:t> Given an integer array nums, return true if any value appears </w:t>
+        <w:t> Given an integer array </w:t>
+      </w:r>
+      <w:proofErr w:type="spellStart"/>
+      <w:r>
+        <w:t>nums</w:t>
+      </w:r>
+      <w:proofErr w:type="spellEnd"/>
+      <w:r>
+        <w:t>, return true if any value appears </w:t>
       </w:r>
       <w:r>
         <w:rPr>
@@ -772,7 +900,6 @@
         <w:rPr>
           <w:noProof/>
         </w:rPr>
-        <w:lastRenderedPageBreak/>
         <w:drawing>
           <wp:inline distT="0" distB="0" distL="0" distR="0" wp14:anchorId="10800B3B" wp14:editId="4A6E1BD0">
             <wp:extent cx="5731510" cy="3034665"/>
@@ -789,7 +916,7 @@
                     <pic:cNvPicPr/>
                   </pic:nvPicPr>
                   <pic:blipFill>
-                    <a:blip r:embed="rId15"/>
+                    <a:blip r:embed="rId17"/>
                     <a:stretch>
                       <a:fillRect/>
                     </a:stretch>
@@ -867,7 +994,7 @@
                     <pic:cNvPicPr/>
                   </pic:nvPicPr>
                   <pic:blipFill>
-                    <a:blip r:embed="rId16"/>
+                    <a:blip r:embed="rId18"/>
                     <a:stretch>
                       <a:fillRect/>
                     </a:stretch>
@@ -908,6 +1035,7 @@
           <w:b/>
           <w:bCs/>
         </w:rPr>
+        <w:lastRenderedPageBreak/>
         <w:t>Java 8 program to perform cube on list elements and filter numbers greater than 50.</w:t>
       </w:r>
     </w:p>
@@ -923,7 +1051,6 @@
         <w:rPr>
           <w:noProof/>
         </w:rPr>
-        <w:lastRenderedPageBreak/>
         <w:t>-</w:t>
       </w:r>
       <w:r>
@@ -946,7 +1073,7 @@
                     <pic:cNvPicPr/>
                   </pic:nvPicPr>
                   <pic:blipFill>
-                    <a:blip r:embed="rId17"/>
+                    <a:blip r:embed="rId19"/>
                     <a:stretch>
                       <a:fillRect/>
                     </a:stretch>
@@ -1008,7 +1135,7 @@
                     <pic:cNvPicPr/>
                   </pic:nvPicPr>
                   <pic:blipFill>
-                    <a:blip r:embed="rId18"/>
+                    <a:blip r:embed="rId20"/>
                     <a:stretch>
                       <a:fillRect/>
                     </a:stretch>
@@ -1069,7 +1196,7 @@
                     <pic:cNvPicPr/>
                   </pic:nvPicPr>
                   <pic:blipFill>
-                    <a:blip r:embed="rId19"/>
+                    <a:blip r:embed="rId21"/>
                     <a:stretch>
                       <a:fillRect/>
                     </a:stretch>
@@ -1103,7 +1230,24 @@
           <w:b/>
           <w:bCs/>
         </w:rPr>
-        <w:t>How to count each element/word from the String ArrayList in Java8?</w:t>
+        <w:lastRenderedPageBreak/>
+        <w:t xml:space="preserve">How to count each element/word from the String </w:t>
+      </w:r>
+      <w:proofErr w:type="spellStart"/>
+      <w:r>
+        <w:rPr>
+          <w:b/>
+          <w:bCs/>
+        </w:rPr>
+        <w:t>ArrayList</w:t>
+      </w:r>
+      <w:proofErr w:type="spellEnd"/>
+      <w:r>
+        <w:rPr>
+          <w:b/>
+          <w:bCs/>
+        </w:rPr>
+        <w:t xml:space="preserve"> in Java8?</w:t>
       </w:r>
     </w:p>
     <w:p>
@@ -1114,7 +1258,6 @@
         <w:rPr>
           <w:noProof/>
         </w:rPr>
-        <w:lastRenderedPageBreak/>
         <w:drawing>
           <wp:inline distT="0" distB="0" distL="0" distR="0" wp14:anchorId="73621873" wp14:editId="624707E6">
             <wp:extent cx="5731510" cy="2165350"/>
@@ -1131,7 +1274,7 @@
                     <pic:cNvPicPr/>
                   </pic:nvPicPr>
                   <pic:blipFill>
-                    <a:blip r:embed="rId20"/>
+                    <a:blip r:embed="rId22"/>
                     <a:stretch>
                       <a:fillRect/>
                     </a:stretch>
@@ -1168,7 +1311,23 @@
           <w:b/>
           <w:bCs/>
         </w:rPr>
-        <w:t>How to find only duplicate elements with its count from the String ArrayList in Java8?</w:t>
+        <w:t xml:space="preserve">How to find only duplicate elements with its count from the String </w:t>
+      </w:r>
+      <w:proofErr w:type="spellStart"/>
+      <w:r>
+        <w:rPr>
+          <w:b/>
+          <w:bCs/>
+        </w:rPr>
+        <w:t>ArrayList</w:t>
+      </w:r>
+      <w:proofErr w:type="spellEnd"/>
+      <w:r>
+        <w:rPr>
+          <w:b/>
+          <w:bCs/>
+        </w:rPr>
+        <w:t xml:space="preserve"> in Java8?</w:t>
       </w:r>
     </w:p>
     <w:p>
@@ -1195,7 +1354,7 @@
                     <pic:cNvPicPr/>
                   </pic:nvPicPr>
                   <pic:blipFill>
-                    <a:blip r:embed="rId21"/>
+                    <a:blip r:embed="rId23"/>
                     <a:stretch>
                       <a:fillRect/>
                     </a:stretch>
@@ -1249,7 +1408,7 @@
                     <pic:cNvPicPr/>
                   </pic:nvPicPr>
                   <pic:blipFill>
-                    <a:blip r:embed="rId22"/>
+                    <a:blip r:embed="rId24"/>
                     <a:stretch>
                       <a:fillRect/>
                     </a:stretch>
@@ -1287,7 +1446,15 @@
         <w:t xml:space="preserve">above image </w:t>
       </w:r>
       <w:r>
-        <w:t>we can use arrays.stream or convert it into list also .</w:t>
+        <w:t xml:space="preserve">we can use </w:t>
+      </w:r>
+      <w:proofErr w:type="spellStart"/>
+      <w:r>
+        <w:t>arrays.stream</w:t>
+      </w:r>
+      <w:proofErr w:type="spellEnd"/>
+      <w:r>
+        <w:t xml:space="preserve"> or convert it into list also .</w:t>
       </w:r>
       <w:r>
         <w:br/>
@@ -1325,7 +1492,7 @@
                     <pic:cNvPicPr/>
                   </pic:nvPicPr>
                   <pic:blipFill>
-                    <a:blip r:embed="rId23"/>
+                    <a:blip r:embed="rId25"/>
                     <a:stretch>
                       <a:fillRect/>
                     </a:stretch>
@@ -1395,7 +1562,7 @@
                     <pic:cNvPicPr/>
                   </pic:nvPicPr>
                   <pic:blipFill>
-                    <a:blip r:embed="rId24"/>
+                    <a:blip r:embed="rId26"/>
                     <a:stretch>
                       <a:fillRect/>
                     </a:stretch>
@@ -1466,7 +1633,7 @@
                     <pic:cNvPicPr/>
                   </pic:nvPicPr>
                   <pic:blipFill>
-                    <a:blip r:embed="rId25"/>
+                    <a:blip r:embed="rId27"/>
                     <a:stretch>
                       <a:fillRect/>
                     </a:stretch>
@@ -1532,7 +1699,7 @@
                     <pic:cNvPicPr/>
                   </pic:nvPicPr>
                   <pic:blipFill>
-                    <a:blip r:embed="rId26"/>
+                    <a:blip r:embed="rId28"/>
                     <a:stretch>
                       <a:fillRect/>
                     </a:stretch>
@@ -1557,7 +1724,15 @@
         <w:t>Compa</w:t>
       </w:r>
       <w:r>
-        <w:t xml:space="preserve">ring By Value </w:t>
+        <w:t xml:space="preserve">ring </w:t>
+      </w:r>
+      <w:proofErr w:type="gramStart"/>
+      <w:r>
+        <w:t>By</w:t>
+      </w:r>
+      <w:proofErr w:type="gramEnd"/>
+      <w:r>
+        <w:t xml:space="preserve"> Value </w:t>
       </w:r>
       <w:r>
         <w:br/>
@@ -1585,7 +1760,7 @@
                     <pic:cNvPicPr/>
                   </pic:nvPicPr>
                   <pic:blipFill>
-                    <a:blip r:embed="rId27"/>
+                    <a:blip r:embed="rId29"/>
                     <a:stretch>
                       <a:fillRect/>
                     </a:stretch>
@@ -1616,10 +1791,18 @@
         <w:t>Pr</w:t>
       </w:r>
       <w:r>
-        <w:t xml:space="preserve">eserve Order </w:t>
-      </w:r>
-      <w:r>
-        <w:t xml:space="preserve"> we </w:t>
+        <w:t xml:space="preserve">eserve </w:t>
+      </w:r>
+      <w:proofErr w:type="gramStart"/>
+      <w:r>
+        <w:t xml:space="preserve">Order </w:t>
+      </w:r>
+      <w:r>
+        <w:t xml:space="preserve"> we</w:t>
+      </w:r>
+      <w:proofErr w:type="gramEnd"/>
+      <w:r>
+        <w:t xml:space="preserve"> </w:t>
       </w:r>
       <w:r>
         <w:t>store values in Map ::</w:t>
@@ -1649,7 +1832,7 @@
                     <pic:cNvPicPr/>
                   </pic:nvPicPr>
                   <pic:blipFill>
-                    <a:blip r:embed="rId28"/>
+                    <a:blip r:embed="rId30"/>
                     <a:stretch>
                       <a:fillRect/>
                     </a:stretch>
@@ -1671,7 +1854,15 @@
       </w:r>
       <w:r>
         <w:br/>
-        <w:t xml:space="preserve">Here we use Map.entrySet() </w:t>
+        <w:t xml:space="preserve">Here we use </w:t>
+      </w:r>
+      <w:proofErr w:type="spellStart"/>
+      <w:r>
+        <w:t>Map.entrySet</w:t>
+      </w:r>
+      <w:proofErr w:type="spellEnd"/>
+      <w:r>
+        <w:t xml:space="preserve">() </w:t>
       </w:r>
       <w:r>
         <w:sym w:font="Wingdings" w:char="F0E0"/>
@@ -1704,7 +1895,7 @@
                     <pic:cNvPicPr/>
                   </pic:nvPicPr>
                   <pic:blipFill>
-                    <a:blip r:embed="rId29"/>
+                    <a:blip r:embed="rId31"/>
                     <a:stretch>
                       <a:fillRect/>
                     </a:stretch>
@@ -1728,7 +1919,15 @@
         <w:br/>
       </w:r>
       <w:r>
-        <w:t xml:space="preserve">Then we use Collectors.toMap </w:t>
+        <w:t xml:space="preserve">Then we use </w:t>
+      </w:r>
+      <w:proofErr w:type="spellStart"/>
+      <w:r>
+        <w:t>Collectors.toMap</w:t>
+      </w:r>
+      <w:proofErr w:type="spellEnd"/>
+      <w:r>
+        <w:t xml:space="preserve"> </w:t>
       </w:r>
       <w:r>
         <w:sym w:font="Wingdings" w:char="F0E0"/>
@@ -1761,7 +1960,7 @@
                     <pic:cNvPicPr/>
                   </pic:nvPicPr>
                   <pic:blipFill>
-                    <a:blip r:embed="rId30"/>
+                    <a:blip r:embed="rId32"/>
                     <a:stretch>
                       <a:fillRect/>
                     </a:stretch>
@@ -1807,7 +2006,7 @@
                     <pic:cNvPicPr/>
                   </pic:nvPicPr>
                   <pic:blipFill>
-                    <a:blip r:embed="rId31"/>
+                    <a:blip r:embed="rId33"/>
                     <a:stretch>
                       <a:fillRect/>
                     </a:stretch>
@@ -1852,8 +2051,17 @@
           <w:b/>
           <w:bCs/>
         </w:rPr>
-        <w:t>filter out string into unique and duplicate list ?</w:t>
-      </w:r>
+        <w:t xml:space="preserve">filter out string into unique and duplicate </w:t>
+      </w:r>
+      <w:proofErr w:type="gramStart"/>
+      <w:r>
+        <w:rPr>
+          <w:b/>
+          <w:bCs/>
+        </w:rPr>
+        <w:t>list ?</w:t>
+      </w:r>
+      <w:proofErr w:type="gramEnd"/>
       <w:r>
         <w:rPr>
           <w:b/>
@@ -1883,7 +2091,7 @@
                     <pic:cNvPicPr/>
                   </pic:nvPicPr>
                   <pic:blipFill>
-                    <a:blip r:embed="rId32"/>
+                    <a:blip r:embed="rId34"/>
                     <a:stretch>
                       <a:fillRect/>
                     </a:stretch>
@@ -1945,7 +2153,21 @@
           <w:b/>
           <w:bCs/>
         </w:rPr>
-        <w:t>annual salary is greater than 5000</w:t>
+        <w:t xml:space="preserve">annual </w:t>
+      </w:r>
+      <w:r>
+        <w:rPr>
+          <w:b/>
+          <w:bCs/>
+        </w:rPr>
+        <w:t>price</w:t>
+      </w:r>
+      <w:r>
+        <w:rPr>
+          <w:b/>
+          <w:bCs/>
+        </w:rPr>
+        <w:t xml:space="preserve"> is greater than 5000</w:t>
       </w:r>
       <w:r>
         <w:rPr>
@@ -1955,6 +2177,7 @@
         <w:br/>
         <w:t xml:space="preserve">provide increment to </w:t>
       </w:r>
+      <w:proofErr w:type="gramStart"/>
       <w:r>
         <w:rPr>
           <w:b/>
@@ -1962,6 +2185,7 @@
         </w:rPr>
         <w:t>1.10 .</w:t>
       </w:r>
+      <w:proofErr w:type="gramEnd"/>
       <w:r>
         <w:rPr>
           <w:b/>
@@ -1976,40 +2200,610 @@
           <w:noProof/>
         </w:rPr>
         <w:drawing>
-          <wp:inline distT="0" distB="0" distL="0" distR="0" wp14:anchorId="51E0B7D9" wp14:editId="7EA786F9">
-            <wp:extent cx="5731510" cy="3646805"/>
+          <wp:inline distT="0" distB="0" distL="0" distR="0" wp14:anchorId="1F067AD3" wp14:editId="4B93AA24">
+            <wp:extent cx="5731510" cy="1445260"/>
+            <wp:effectExtent l="0" t="0" r="2540" b="2540"/>
+            <wp:docPr id="1651349056" name="Picture 1"/>
+            <wp:cNvGraphicFramePr>
+              <a:graphicFrameLocks xmlns:a="http://schemas.openxmlformats.org/drawingml/2006/main" noChangeAspect="1"/>
+            </wp:cNvGraphicFramePr>
+            <a:graphic xmlns:a="http://schemas.openxmlformats.org/drawingml/2006/main">
+              <a:graphicData uri="http://schemas.openxmlformats.org/drawingml/2006/picture">
+                <pic:pic xmlns:pic="http://schemas.openxmlformats.org/drawingml/2006/picture">
+                  <pic:nvPicPr>
+                    <pic:cNvPr id="1651349056" name=""/>
+                    <pic:cNvPicPr/>
+                  </pic:nvPicPr>
+                  <pic:blipFill>
+                    <a:blip r:embed="rId35"/>
+                    <a:stretch>
+                      <a:fillRect/>
+                    </a:stretch>
+                  </pic:blipFill>
+                  <pic:spPr>
+                    <a:xfrm>
+                      <a:off x="0" y="0"/>
+                      <a:ext cx="5731510" cy="1445260"/>
+                    </a:xfrm>
+                    <a:prstGeom prst="rect">
+                      <a:avLst/>
+                    </a:prstGeom>
+                  </pic:spPr>
+                </pic:pic>
+              </a:graphicData>
+            </a:graphic>
+          </wp:inline>
+        </w:drawing>
+      </w:r>
+    </w:p>
+    <w:p>
+      <w:pPr>
+        <w:ind w:left="720"/>
+        <w:rPr>
+          <w:b/>
+          <w:bCs/>
+        </w:rPr>
+      </w:pPr>
+      <w:r>
+        <w:rPr>
+          <w:b/>
+          <w:bCs/>
+          <w:noProof/>
+        </w:rPr>
+        <w:lastRenderedPageBreak/>
+        <w:drawing>
+          <wp:inline distT="0" distB="0" distL="0" distR="0" wp14:anchorId="0F0AD48A" wp14:editId="109BCEF7">
+            <wp:extent cx="5731510" cy="4639945"/>
+            <wp:effectExtent l="0" t="0" r="2540" b="8255"/>
+            <wp:docPr id="675499572" name="Picture 1"/>
+            <wp:cNvGraphicFramePr>
+              <a:graphicFrameLocks xmlns:a="http://schemas.openxmlformats.org/drawingml/2006/main" noChangeAspect="1"/>
+            </wp:cNvGraphicFramePr>
+            <a:graphic xmlns:a="http://schemas.openxmlformats.org/drawingml/2006/main">
+              <a:graphicData uri="http://schemas.openxmlformats.org/drawingml/2006/picture">
+                <pic:pic xmlns:pic="http://schemas.openxmlformats.org/drawingml/2006/picture">
+                  <pic:nvPicPr>
+                    <pic:cNvPr id="675499572" name=""/>
+                    <pic:cNvPicPr/>
+                  </pic:nvPicPr>
+                  <pic:blipFill>
+                    <a:blip r:embed="rId36"/>
+                    <a:stretch>
+                      <a:fillRect/>
+                    </a:stretch>
+                  </pic:blipFill>
+                  <pic:spPr>
+                    <a:xfrm>
+                      <a:off x="0" y="0"/>
+                      <a:ext cx="5731510" cy="4639945"/>
+                    </a:xfrm>
+                    <a:prstGeom prst="rect">
+                      <a:avLst/>
+                    </a:prstGeom>
+                  </pic:spPr>
+                </pic:pic>
+              </a:graphicData>
+            </a:graphic>
+          </wp:inline>
+        </w:drawing>
+      </w:r>
+      <w:r>
+        <w:rPr>
+          <w:b/>
+          <w:bCs/>
+        </w:rPr>
+        <w:br/>
+      </w:r>
+      <w:r>
+        <w:rPr>
+          <w:b/>
+          <w:bCs/>
+        </w:rPr>
+        <w:br/>
+      </w:r>
+      <w:r>
+        <w:rPr>
+          <w:b/>
+          <w:bCs/>
+        </w:rPr>
+        <w:br/>
+      </w:r>
+      <w:r>
+        <w:rPr>
+          <w:b/>
+          <w:bCs/>
+        </w:rPr>
+        <w:lastRenderedPageBreak/>
+        <w:br/>
+      </w:r>
+      <w:r>
+        <w:rPr>
+          <w:b/>
+          <w:bCs/>
+          <w:noProof/>
+        </w:rPr>
+        <w:drawing>
+          <wp:inline distT="0" distB="0" distL="0" distR="0" wp14:anchorId="6436B3C1" wp14:editId="3B4E043A">
+            <wp:extent cx="5731510" cy="3547745"/>
             <wp:effectExtent l="0" t="0" r="2540" b="0"/>
-            <wp:docPr id="778259661" name="Picture 1"/>
-            <wp:cNvGraphicFramePr>
-              <a:graphicFrameLocks xmlns:a="http://schemas.openxmlformats.org/drawingml/2006/main" noChangeAspect="1"/>
-            </wp:cNvGraphicFramePr>
-            <a:graphic xmlns:a="http://schemas.openxmlformats.org/drawingml/2006/main">
-              <a:graphicData uri="http://schemas.openxmlformats.org/drawingml/2006/picture">
-                <pic:pic xmlns:pic="http://schemas.openxmlformats.org/drawingml/2006/picture">
-                  <pic:nvPicPr>
-                    <pic:cNvPr id="778259661" name=""/>
-                    <pic:cNvPicPr/>
-                  </pic:nvPicPr>
-                  <pic:blipFill>
-                    <a:blip r:embed="rId33"/>
-                    <a:stretch>
-                      <a:fillRect/>
-                    </a:stretch>
-                  </pic:blipFill>
-                  <pic:spPr>
-                    <a:xfrm>
-                      <a:off x="0" y="0"/>
-                      <a:ext cx="5731510" cy="3646805"/>
-                    </a:xfrm>
-                    <a:prstGeom prst="rect">
-                      <a:avLst/>
-                    </a:prstGeom>
-                  </pic:spPr>
-                </pic:pic>
-              </a:graphicData>
-            </a:graphic>
-          </wp:inline>
-        </w:drawing>
+            <wp:docPr id="1152535364" name="Picture 1"/>
+            <wp:cNvGraphicFramePr>
+              <a:graphicFrameLocks xmlns:a="http://schemas.openxmlformats.org/drawingml/2006/main" noChangeAspect="1"/>
+            </wp:cNvGraphicFramePr>
+            <a:graphic xmlns:a="http://schemas.openxmlformats.org/drawingml/2006/main">
+              <a:graphicData uri="http://schemas.openxmlformats.org/drawingml/2006/picture">
+                <pic:pic xmlns:pic="http://schemas.openxmlformats.org/drawingml/2006/picture">
+                  <pic:nvPicPr>
+                    <pic:cNvPr id="1152535364" name=""/>
+                    <pic:cNvPicPr/>
+                  </pic:nvPicPr>
+                  <pic:blipFill>
+                    <a:blip r:embed="rId37"/>
+                    <a:stretch>
+                      <a:fillRect/>
+                    </a:stretch>
+                  </pic:blipFill>
+                  <pic:spPr>
+                    <a:xfrm>
+                      <a:off x="0" y="0"/>
+                      <a:ext cx="5731510" cy="3547745"/>
+                    </a:xfrm>
+                    <a:prstGeom prst="rect">
+                      <a:avLst/>
+                    </a:prstGeom>
+                  </pic:spPr>
+                </pic:pic>
+              </a:graphicData>
+            </a:graphic>
+          </wp:inline>
+        </w:drawing>
+      </w:r>
+    </w:p>
+    <w:p>
+      <w:pPr>
+        <w:ind w:left="720"/>
+        <w:rPr>
+          <w:b/>
+          <w:bCs/>
+        </w:rPr>
+      </w:pPr>
+    </w:p>
+    <w:p>
+      <w:pPr>
+        <w:ind w:left="720"/>
+        <w:rPr>
+          <w:b/>
+          <w:bCs/>
+        </w:rPr>
+      </w:pPr>
+      <w:r>
+        <w:rPr>
+          <w:b/>
+          <w:bCs/>
+          <w:noProof/>
+        </w:rPr>
+        <w:drawing>
+          <wp:inline distT="0" distB="0" distL="0" distR="0" wp14:anchorId="2CF764F3" wp14:editId="5D9CAD1D">
+            <wp:extent cx="5731510" cy="2136775"/>
+            <wp:effectExtent l="0" t="0" r="2540" b="0"/>
+            <wp:docPr id="940641356" name="Picture 1"/>
+            <wp:cNvGraphicFramePr>
+              <a:graphicFrameLocks xmlns:a="http://schemas.openxmlformats.org/drawingml/2006/main" noChangeAspect="1"/>
+            </wp:cNvGraphicFramePr>
+            <a:graphic xmlns:a="http://schemas.openxmlformats.org/drawingml/2006/main">
+              <a:graphicData uri="http://schemas.openxmlformats.org/drawingml/2006/picture">
+                <pic:pic xmlns:pic="http://schemas.openxmlformats.org/drawingml/2006/picture">
+                  <pic:nvPicPr>
+                    <pic:cNvPr id="940641356" name=""/>
+                    <pic:cNvPicPr/>
+                  </pic:nvPicPr>
+                  <pic:blipFill>
+                    <a:blip r:embed="rId38"/>
+                    <a:stretch>
+                      <a:fillRect/>
+                    </a:stretch>
+                  </pic:blipFill>
+                  <pic:spPr>
+                    <a:xfrm>
+                      <a:off x="0" y="0"/>
+                      <a:ext cx="5731510" cy="2136775"/>
+                    </a:xfrm>
+                    <a:prstGeom prst="rect">
+                      <a:avLst/>
+                    </a:prstGeom>
+                  </pic:spPr>
+                </pic:pic>
+              </a:graphicData>
+            </a:graphic>
+          </wp:inline>
+        </w:drawing>
+      </w:r>
+      <w:r>
+        <w:rPr>
+          <w:b/>
+          <w:bCs/>
+        </w:rPr>
+        <w:br/>
+      </w:r>
+      <w:r>
+        <w:rPr>
+          <w:b/>
+          <w:bCs/>
+        </w:rPr>
+        <w:br/>
+      </w:r>
+      <w:r>
+        <w:rPr>
+          <w:b/>
+          <w:bCs/>
+          <w:noProof/>
+        </w:rPr>
+        <w:drawing>
+          <wp:inline distT="0" distB="0" distL="0" distR="0" wp14:anchorId="7F094E9A" wp14:editId="535A6FA7">
+            <wp:extent cx="5731510" cy="1174115"/>
+            <wp:effectExtent l="0" t="0" r="2540" b="6985"/>
+            <wp:docPr id="618485679" name="Picture 1"/>
+            <wp:cNvGraphicFramePr>
+              <a:graphicFrameLocks xmlns:a="http://schemas.openxmlformats.org/drawingml/2006/main" noChangeAspect="1"/>
+            </wp:cNvGraphicFramePr>
+            <a:graphic xmlns:a="http://schemas.openxmlformats.org/drawingml/2006/main">
+              <a:graphicData uri="http://schemas.openxmlformats.org/drawingml/2006/picture">
+                <pic:pic xmlns:pic="http://schemas.openxmlformats.org/drawingml/2006/picture">
+                  <pic:nvPicPr>
+                    <pic:cNvPr id="618485679" name=""/>
+                    <pic:cNvPicPr/>
+                  </pic:nvPicPr>
+                  <pic:blipFill>
+                    <a:blip r:embed="rId39"/>
+                    <a:stretch>
+                      <a:fillRect/>
+                    </a:stretch>
+                  </pic:blipFill>
+                  <pic:spPr>
+                    <a:xfrm>
+                      <a:off x="0" y="0"/>
+                      <a:ext cx="5731510" cy="1174115"/>
+                    </a:xfrm>
+                    <a:prstGeom prst="rect">
+                      <a:avLst/>
+                    </a:prstGeom>
+                  </pic:spPr>
+                </pic:pic>
+              </a:graphicData>
+            </a:graphic>
+          </wp:inline>
+        </w:drawing>
+      </w:r>
+      <w:r>
+        <w:rPr>
+          <w:b/>
+          <w:bCs/>
+        </w:rPr>
+        <w:br/>
+      </w:r>
+      <w:r>
+        <w:rPr>
+          <w:b/>
+          <w:bCs/>
+        </w:rPr>
+        <w:br/>
+      </w:r>
+      <w:r>
+        <w:rPr>
+          <w:b/>
+          <w:bCs/>
+          <w:noProof/>
+        </w:rPr>
+        <w:lastRenderedPageBreak/>
+        <w:drawing>
+          <wp:inline distT="0" distB="0" distL="0" distR="0" wp14:anchorId="2D96F958" wp14:editId="21079FD4">
+            <wp:extent cx="5731510" cy="953770"/>
+            <wp:effectExtent l="0" t="0" r="2540" b="0"/>
+            <wp:docPr id="901490832" name="Picture 1"/>
+            <wp:cNvGraphicFramePr>
+              <a:graphicFrameLocks xmlns:a="http://schemas.openxmlformats.org/drawingml/2006/main" noChangeAspect="1"/>
+            </wp:cNvGraphicFramePr>
+            <a:graphic xmlns:a="http://schemas.openxmlformats.org/drawingml/2006/main">
+              <a:graphicData uri="http://schemas.openxmlformats.org/drawingml/2006/picture">
+                <pic:pic xmlns:pic="http://schemas.openxmlformats.org/drawingml/2006/picture">
+                  <pic:nvPicPr>
+                    <pic:cNvPr id="901490832" name=""/>
+                    <pic:cNvPicPr/>
+                  </pic:nvPicPr>
+                  <pic:blipFill>
+                    <a:blip r:embed="rId40"/>
+                    <a:stretch>
+                      <a:fillRect/>
+                    </a:stretch>
+                  </pic:blipFill>
+                  <pic:spPr>
+                    <a:xfrm>
+                      <a:off x="0" y="0"/>
+                      <a:ext cx="5731510" cy="953770"/>
+                    </a:xfrm>
+                    <a:prstGeom prst="rect">
+                      <a:avLst/>
+                    </a:prstGeom>
+                  </pic:spPr>
+                </pic:pic>
+              </a:graphicData>
+            </a:graphic>
+          </wp:inline>
+        </w:drawing>
+      </w:r>
+      <w:r>
+        <w:rPr>
+          <w:b/>
+          <w:bCs/>
+        </w:rPr>
+        <w:br/>
+      </w:r>
+      <w:r>
+        <w:rPr>
+          <w:b/>
+          <w:bCs/>
+        </w:rPr>
+        <w:br/>
+      </w:r>
+      <w:r>
+        <w:rPr>
+          <w:b/>
+          <w:bCs/>
+          <w:noProof/>
+        </w:rPr>
+        <w:drawing>
+          <wp:inline distT="0" distB="0" distL="0" distR="0" wp14:anchorId="2438683B" wp14:editId="0612A17E">
+            <wp:extent cx="5731510" cy="1021080"/>
+            <wp:effectExtent l="0" t="0" r="2540" b="7620"/>
+            <wp:docPr id="540818256" name="Picture 1"/>
+            <wp:cNvGraphicFramePr>
+              <a:graphicFrameLocks xmlns:a="http://schemas.openxmlformats.org/drawingml/2006/main" noChangeAspect="1"/>
+            </wp:cNvGraphicFramePr>
+            <a:graphic xmlns:a="http://schemas.openxmlformats.org/drawingml/2006/main">
+              <a:graphicData uri="http://schemas.openxmlformats.org/drawingml/2006/picture">
+                <pic:pic xmlns:pic="http://schemas.openxmlformats.org/drawingml/2006/picture">
+                  <pic:nvPicPr>
+                    <pic:cNvPr id="540818256" name=""/>
+                    <pic:cNvPicPr/>
+                  </pic:nvPicPr>
+                  <pic:blipFill>
+                    <a:blip r:embed="rId41"/>
+                    <a:stretch>
+                      <a:fillRect/>
+                    </a:stretch>
+                  </pic:blipFill>
+                  <pic:spPr>
+                    <a:xfrm>
+                      <a:off x="0" y="0"/>
+                      <a:ext cx="5731510" cy="1021080"/>
+                    </a:xfrm>
+                    <a:prstGeom prst="rect">
+                      <a:avLst/>
+                    </a:prstGeom>
+                  </pic:spPr>
+                </pic:pic>
+              </a:graphicData>
+            </a:graphic>
+          </wp:inline>
+        </w:drawing>
+      </w:r>
+      <w:r>
+        <w:rPr>
+          <w:b/>
+          <w:bCs/>
+        </w:rPr>
+        <w:br/>
+      </w:r>
+      <w:r>
+        <w:rPr>
+          <w:b/>
+          <w:bCs/>
+          <w:noProof/>
+        </w:rPr>
+        <w:drawing>
+          <wp:inline distT="0" distB="0" distL="0" distR="0" wp14:anchorId="108D4FE9" wp14:editId="61133A58">
+            <wp:extent cx="5731510" cy="894715"/>
+            <wp:effectExtent l="0" t="0" r="2540" b="635"/>
+            <wp:docPr id="955919029" name="Picture 1"/>
+            <wp:cNvGraphicFramePr>
+              <a:graphicFrameLocks xmlns:a="http://schemas.openxmlformats.org/drawingml/2006/main" noChangeAspect="1"/>
+            </wp:cNvGraphicFramePr>
+            <a:graphic xmlns:a="http://schemas.openxmlformats.org/drawingml/2006/main">
+              <a:graphicData uri="http://schemas.openxmlformats.org/drawingml/2006/picture">
+                <pic:pic xmlns:pic="http://schemas.openxmlformats.org/drawingml/2006/picture">
+                  <pic:nvPicPr>
+                    <pic:cNvPr id="955919029" name=""/>
+                    <pic:cNvPicPr/>
+                  </pic:nvPicPr>
+                  <pic:blipFill>
+                    <a:blip r:embed="rId42"/>
+                    <a:stretch>
+                      <a:fillRect/>
+                    </a:stretch>
+                  </pic:blipFill>
+                  <pic:spPr>
+                    <a:xfrm>
+                      <a:off x="0" y="0"/>
+                      <a:ext cx="5731510" cy="894715"/>
+                    </a:xfrm>
+                    <a:prstGeom prst="rect">
+                      <a:avLst/>
+                    </a:prstGeom>
+                  </pic:spPr>
+                </pic:pic>
+              </a:graphicData>
+            </a:graphic>
+          </wp:inline>
+        </w:drawing>
+      </w:r>
+      <w:r>
+        <w:rPr>
+          <w:b/>
+          <w:bCs/>
+        </w:rPr>
+        <w:br/>
+      </w:r>
+      <w:r>
+        <w:rPr>
+          <w:b/>
+          <w:bCs/>
+          <w:noProof/>
+        </w:rPr>
+        <w:drawing>
+          <wp:inline distT="0" distB="0" distL="0" distR="0" wp14:anchorId="2D8712CC" wp14:editId="617FF289">
+            <wp:extent cx="5731510" cy="2002155"/>
+            <wp:effectExtent l="0" t="0" r="2540" b="0"/>
+            <wp:docPr id="1393803333" name="Picture 1"/>
+            <wp:cNvGraphicFramePr>
+              <a:graphicFrameLocks xmlns:a="http://schemas.openxmlformats.org/drawingml/2006/main" noChangeAspect="1"/>
+            </wp:cNvGraphicFramePr>
+            <a:graphic xmlns:a="http://schemas.openxmlformats.org/drawingml/2006/main">
+              <a:graphicData uri="http://schemas.openxmlformats.org/drawingml/2006/picture">
+                <pic:pic xmlns:pic="http://schemas.openxmlformats.org/drawingml/2006/picture">
+                  <pic:nvPicPr>
+                    <pic:cNvPr id="1393803333" name=""/>
+                    <pic:cNvPicPr/>
+                  </pic:nvPicPr>
+                  <pic:blipFill>
+                    <a:blip r:embed="rId43"/>
+                    <a:stretch>
+                      <a:fillRect/>
+                    </a:stretch>
+                  </pic:blipFill>
+                  <pic:spPr>
+                    <a:xfrm>
+                      <a:off x="0" y="0"/>
+                      <a:ext cx="5731510" cy="2002155"/>
+                    </a:xfrm>
+                    <a:prstGeom prst="rect">
+                      <a:avLst/>
+                    </a:prstGeom>
+                  </pic:spPr>
+                </pic:pic>
+              </a:graphicData>
+            </a:graphic>
+          </wp:inline>
+        </w:drawing>
+      </w:r>
+      <w:r>
+        <w:rPr>
+          <w:b/>
+          <w:bCs/>
+        </w:rPr>
+        <w:br/>
+      </w:r>
+      <w:r>
+        <w:rPr>
+          <w:b/>
+          <w:bCs/>
+        </w:rPr>
+        <w:br/>
+      </w:r>
+      <w:r>
+        <w:rPr>
+          <w:b/>
+          <w:bCs/>
+          <w:noProof/>
+        </w:rPr>
+        <w:lastRenderedPageBreak/>
+        <w:drawing>
+          <wp:inline distT="0" distB="0" distL="0" distR="0" wp14:anchorId="3E4D8343" wp14:editId="3CCE8D62">
+            <wp:extent cx="5731510" cy="3863975"/>
+            <wp:effectExtent l="0" t="0" r="2540" b="3175"/>
+            <wp:docPr id="545742612" name="Picture 1"/>
+            <wp:cNvGraphicFramePr>
+              <a:graphicFrameLocks xmlns:a="http://schemas.openxmlformats.org/drawingml/2006/main" noChangeAspect="1"/>
+            </wp:cNvGraphicFramePr>
+            <a:graphic xmlns:a="http://schemas.openxmlformats.org/drawingml/2006/main">
+              <a:graphicData uri="http://schemas.openxmlformats.org/drawingml/2006/picture">
+                <pic:pic xmlns:pic="http://schemas.openxmlformats.org/drawingml/2006/picture">
+                  <pic:nvPicPr>
+                    <pic:cNvPr id="545742612" name=""/>
+                    <pic:cNvPicPr/>
+                  </pic:nvPicPr>
+                  <pic:blipFill>
+                    <a:blip r:embed="rId44"/>
+                    <a:stretch>
+                      <a:fillRect/>
+                    </a:stretch>
+                  </pic:blipFill>
+                  <pic:spPr>
+                    <a:xfrm>
+                      <a:off x="0" y="0"/>
+                      <a:ext cx="5731510" cy="3863975"/>
+                    </a:xfrm>
+                    <a:prstGeom prst="rect">
+                      <a:avLst/>
+                    </a:prstGeom>
+                  </pic:spPr>
+                </pic:pic>
+              </a:graphicData>
+            </a:graphic>
+          </wp:inline>
+        </w:drawing>
+      </w:r>
+      <w:r>
+        <w:rPr>
+          <w:b/>
+          <w:bCs/>
+        </w:rPr>
+        <w:br/>
+      </w:r>
+      <w:r>
+        <w:rPr>
+          <w:b/>
+          <w:bCs/>
+          <w:noProof/>
+        </w:rPr>
+        <w:drawing>
+          <wp:inline distT="0" distB="0" distL="0" distR="0" wp14:anchorId="16837453" wp14:editId="53C8140B">
+            <wp:extent cx="5731510" cy="2294890"/>
+            <wp:effectExtent l="0" t="0" r="2540" b="0"/>
+            <wp:docPr id="661441511" name="Picture 1"/>
+            <wp:cNvGraphicFramePr>
+              <a:graphicFrameLocks xmlns:a="http://schemas.openxmlformats.org/drawingml/2006/main" noChangeAspect="1"/>
+            </wp:cNvGraphicFramePr>
+            <a:graphic xmlns:a="http://schemas.openxmlformats.org/drawingml/2006/main">
+              <a:graphicData uri="http://schemas.openxmlformats.org/drawingml/2006/picture">
+                <pic:pic xmlns:pic="http://schemas.openxmlformats.org/drawingml/2006/picture">
+                  <pic:nvPicPr>
+                    <pic:cNvPr id="661441511" name=""/>
+                    <pic:cNvPicPr/>
+                  </pic:nvPicPr>
+                  <pic:blipFill>
+                    <a:blip r:embed="rId45"/>
+                    <a:stretch>
+                      <a:fillRect/>
+                    </a:stretch>
+                  </pic:blipFill>
+                  <pic:spPr>
+                    <a:xfrm>
+                      <a:off x="0" y="0"/>
+                      <a:ext cx="5731510" cy="2294890"/>
+                    </a:xfrm>
+                    <a:prstGeom prst="rect">
+                      <a:avLst/>
+                    </a:prstGeom>
+                  </pic:spPr>
+                </pic:pic>
+              </a:graphicData>
+            </a:graphic>
+          </wp:inline>
+        </w:drawing>
+      </w:r>
+      <w:r>
+        <w:rPr>
+          <w:b/>
+          <w:bCs/>
+        </w:rPr>
+        <w:t xml:space="preserve"> </w:t>
+      </w:r>
+      <w:r>
+        <w:rPr>
+          <w:b/>
+          <w:bCs/>
+        </w:rPr>
+        <w:br/>
       </w:r>
       <w:r>
         <w:rPr>
@@ -2041,7 +2835,7 @@
                     <pic:cNvPicPr/>
                   </pic:nvPicPr>
                   <pic:blipFill>
-                    <a:blip r:embed="rId34"/>
+                    <a:blip r:embed="rId46"/>
                     <a:stretch>
                       <a:fillRect/>
                     </a:stretch>
@@ -2090,7 +2884,7 @@
                     <pic:cNvPicPr/>
                   </pic:nvPicPr>
                   <pic:blipFill>
-                    <a:blip r:embed="rId35"/>
+                    <a:blip r:embed="rId47"/>
                     <a:stretch>
                       <a:fillRect/>
                     </a:stretch>
@@ -2150,7 +2944,7 @@
                     <pic:cNvPicPr/>
                   </pic:nvPicPr>
                   <pic:blipFill>
-                    <a:blip r:embed="rId36"/>
+                    <a:blip r:embed="rId48"/>
                     <a:stretch>
                       <a:fillRect/>
                     </a:stretch>
@@ -2209,7 +3003,7 @@
                     <pic:cNvPicPr/>
                   </pic:nvPicPr>
                   <pic:blipFill>
-                    <a:blip r:embed="rId37"/>
+                    <a:blip r:embed="rId49"/>
                     <a:stretch>
                       <a:fillRect/>
                     </a:stretch>
@@ -2269,7 +3063,7 @@
                     <pic:cNvPicPr/>
                   </pic:nvPicPr>
                   <pic:blipFill>
-                    <a:blip r:embed="rId38"/>
+                    <a:blip r:embed="rId50"/>
                     <a:stretch>
                       <a:fillRect/>
                     </a:stretch>
@@ -2333,7 +3127,7 @@
                     <pic:cNvPicPr/>
                   </pic:nvPicPr>
                   <pic:blipFill>
-                    <a:blip r:embed="rId39"/>
+                    <a:blip r:embed="rId51"/>
                     <a:stretch>
                       <a:fillRect/>
                     </a:stretch>
@@ -2405,7 +3199,7 @@
                     <pic:cNvPicPr/>
                   </pic:nvPicPr>
                   <pic:blipFill>
-                    <a:blip r:embed="rId40"/>
+                    <a:blip r:embed="rId52"/>
                     <a:stretch>
                       <a:fillRect/>
                     </a:stretch>
@@ -2444,8 +3238,17 @@
           <w:b/>
           <w:bCs/>
         </w:rPr>
-        <w:t>Second Highest Salary employee Name :</w:t>
-      </w:r>
+        <w:t xml:space="preserve">Second Highest Salary employee </w:t>
+      </w:r>
+      <w:proofErr w:type="gramStart"/>
+      <w:r>
+        <w:rPr>
+          <w:b/>
+          <w:bCs/>
+        </w:rPr>
+        <w:t>Name :</w:t>
+      </w:r>
+      <w:proofErr w:type="gramEnd"/>
     </w:p>
     <w:p>
       <w:pPr>
@@ -2467,33 +3270,527 @@
         <w:rPr>
           <w:b/>
           <w:bCs/>
-          <w:noProof/>
-        </w:rPr>
-        <w:drawing>
-          <wp:inline distT="0" distB="0" distL="0" distR="0" wp14:anchorId="1AE11A26" wp14:editId="04378F55">
-            <wp:extent cx="5731510" cy="2800985"/>
+        </w:rPr>
+        <w:drawing>
+          <wp:inline distT="0" distB="0" distL="0" distR="0" wp14:anchorId="61F9787D" wp14:editId="0ACDA434">
+            <wp:extent cx="5731510" cy="2459355"/>
             <wp:effectExtent l="0" t="0" r="2540" b="0"/>
-            <wp:docPr id="1880775295" name="Picture 1"/>
-            <wp:cNvGraphicFramePr>
-              <a:graphicFrameLocks xmlns:a="http://schemas.openxmlformats.org/drawingml/2006/main" noChangeAspect="1"/>
-            </wp:cNvGraphicFramePr>
-            <a:graphic xmlns:a="http://schemas.openxmlformats.org/drawingml/2006/main">
-              <a:graphicData uri="http://schemas.openxmlformats.org/drawingml/2006/picture">
-                <pic:pic xmlns:pic="http://schemas.openxmlformats.org/drawingml/2006/picture">
-                  <pic:nvPicPr>
-                    <pic:cNvPr id="1880775295" name=""/>
-                    <pic:cNvPicPr/>
-                  </pic:nvPicPr>
-                  <pic:blipFill>
-                    <a:blip r:embed="rId41"/>
-                    <a:stretch>
-                      <a:fillRect/>
-                    </a:stretch>
-                  </pic:blipFill>
-                  <pic:spPr>
-                    <a:xfrm>
-                      <a:off x="0" y="0"/>
-                      <a:ext cx="5731510" cy="2800985"/>
+            <wp:docPr id="1059833705" name="Picture 1"/>
+            <wp:cNvGraphicFramePr>
+              <a:graphicFrameLocks xmlns:a="http://schemas.openxmlformats.org/drawingml/2006/main" noChangeAspect="1"/>
+            </wp:cNvGraphicFramePr>
+            <a:graphic xmlns:a="http://schemas.openxmlformats.org/drawingml/2006/main">
+              <a:graphicData uri="http://schemas.openxmlformats.org/drawingml/2006/picture">
+                <pic:pic xmlns:pic="http://schemas.openxmlformats.org/drawingml/2006/picture">
+                  <pic:nvPicPr>
+                    <pic:cNvPr id="1059833705" name=""/>
+                    <pic:cNvPicPr/>
+                  </pic:nvPicPr>
+                  <pic:blipFill>
+                    <a:blip r:embed="rId53"/>
+                    <a:stretch>
+                      <a:fillRect/>
+                    </a:stretch>
+                  </pic:blipFill>
+                  <pic:spPr>
+                    <a:xfrm>
+                      <a:off x="0" y="0"/>
+                      <a:ext cx="5731510" cy="2459355"/>
+                    </a:xfrm>
+                    <a:prstGeom prst="rect">
+                      <a:avLst/>
+                    </a:prstGeom>
+                  </pic:spPr>
+                </pic:pic>
+              </a:graphicData>
+            </a:graphic>
+          </wp:inline>
+        </w:drawing>
+      </w:r>
+      <w:r>
+        <w:rPr>
+          <w:b/>
+          <w:bCs/>
+        </w:rPr>
+        <w:br/>
+      </w:r>
+      <w:r>
+        <w:rPr>
+          <w:b/>
+          <w:bCs/>
+          <w:highlight w:val="yellow"/>
+        </w:rPr>
+        <w:t>Not a correct approach ::</w:t>
+      </w:r>
+      <w:r>
+        <w:rPr>
+          <w:b/>
+          <w:bCs/>
+        </w:rPr>
+        <w:br/>
+      </w:r>
+      <w:r>
+        <w:rPr>
+          <w:b/>
+          <w:bCs/>
+        </w:rPr>
+        <w:br/>
+      </w:r>
+      <w:r>
+        <w:rPr>
+          <w:b/>
+          <w:bCs/>
+        </w:rPr>
+        <w:drawing>
+          <wp:inline distT="0" distB="0" distL="0" distR="0" wp14:anchorId="09E06948" wp14:editId="57AA69A4">
+            <wp:extent cx="5731510" cy="4657090"/>
+            <wp:effectExtent l="0" t="0" r="2540" b="0"/>
+            <wp:docPr id="1641922587" name="Picture 1"/>
+            <wp:cNvGraphicFramePr>
+              <a:graphicFrameLocks xmlns:a="http://schemas.openxmlformats.org/drawingml/2006/main" noChangeAspect="1"/>
+            </wp:cNvGraphicFramePr>
+            <a:graphic xmlns:a="http://schemas.openxmlformats.org/drawingml/2006/main">
+              <a:graphicData uri="http://schemas.openxmlformats.org/drawingml/2006/picture">
+                <pic:pic xmlns:pic="http://schemas.openxmlformats.org/drawingml/2006/picture">
+                  <pic:nvPicPr>
+                    <pic:cNvPr id="1641922587" name=""/>
+                    <pic:cNvPicPr/>
+                  </pic:nvPicPr>
+                  <pic:blipFill>
+                    <a:blip r:embed="rId54"/>
+                    <a:stretch>
+                      <a:fillRect/>
+                    </a:stretch>
+                  </pic:blipFill>
+                  <pic:spPr>
+                    <a:xfrm>
+                      <a:off x="0" y="0"/>
+                      <a:ext cx="5731510" cy="4657090"/>
+                    </a:xfrm>
+                    <a:prstGeom prst="rect">
+                      <a:avLst/>
+                    </a:prstGeom>
+                  </pic:spPr>
+                </pic:pic>
+              </a:graphicData>
+            </a:graphic>
+          </wp:inline>
+        </w:drawing>
+      </w:r>
+      <w:r>
+        <w:rPr>
+          <w:b/>
+          <w:bCs/>
+        </w:rPr>
+        <w:br/>
+      </w:r>
+      <w:r>
+        <w:rPr>
+          <w:b/>
+          <w:bCs/>
+        </w:rPr>
+        <w:br/>
+      </w:r>
+      <w:r>
+        <w:rPr>
+          <w:b/>
+          <w:bCs/>
+        </w:rPr>
+        <w:lastRenderedPageBreak/>
+        <w:drawing>
+          <wp:inline distT="0" distB="0" distL="0" distR="0" wp14:anchorId="14772FFC" wp14:editId="1F3801A7">
+            <wp:extent cx="5731510" cy="1172210"/>
+            <wp:effectExtent l="0" t="0" r="2540" b="8890"/>
+            <wp:docPr id="1454176492" name="Picture 1"/>
+            <wp:cNvGraphicFramePr>
+              <a:graphicFrameLocks xmlns:a="http://schemas.openxmlformats.org/drawingml/2006/main" noChangeAspect="1"/>
+            </wp:cNvGraphicFramePr>
+            <a:graphic xmlns:a="http://schemas.openxmlformats.org/drawingml/2006/main">
+              <a:graphicData uri="http://schemas.openxmlformats.org/drawingml/2006/picture">
+                <pic:pic xmlns:pic="http://schemas.openxmlformats.org/drawingml/2006/picture">
+                  <pic:nvPicPr>
+                    <pic:cNvPr id="1454176492" name=""/>
+                    <pic:cNvPicPr/>
+                  </pic:nvPicPr>
+                  <pic:blipFill>
+                    <a:blip r:embed="rId55"/>
+                    <a:stretch>
+                      <a:fillRect/>
+                    </a:stretch>
+                  </pic:blipFill>
+                  <pic:spPr>
+                    <a:xfrm>
+                      <a:off x="0" y="0"/>
+                      <a:ext cx="5731510" cy="1172210"/>
+                    </a:xfrm>
+                    <a:prstGeom prst="rect">
+                      <a:avLst/>
+                    </a:prstGeom>
+                  </pic:spPr>
+                </pic:pic>
+              </a:graphicData>
+            </a:graphic>
+          </wp:inline>
+        </w:drawing>
+      </w:r>
+      <w:r>
+        <w:rPr>
+          <w:b/>
+          <w:bCs/>
+        </w:rPr>
+        <w:br/>
+      </w:r>
+      <w:r>
+        <w:rPr>
+          <w:b/>
+          <w:bCs/>
+        </w:rPr>
+        <w:br/>
+        <w:t>How this flow works ::</w:t>
+      </w:r>
+      <w:r>
+        <w:rPr>
+          <w:b/>
+          <w:bCs/>
+        </w:rPr>
+        <w:br/>
+      </w:r>
+      <w:r>
+        <w:rPr>
+          <w:b/>
+          <w:bCs/>
+        </w:rPr>
+        <w:drawing>
+          <wp:inline distT="0" distB="0" distL="0" distR="0" wp14:anchorId="6A879988" wp14:editId="66C353D1">
+            <wp:extent cx="5731510" cy="4973955"/>
+            <wp:effectExtent l="0" t="0" r="2540" b="0"/>
+            <wp:docPr id="872794539" name="Picture 1"/>
+            <wp:cNvGraphicFramePr>
+              <a:graphicFrameLocks xmlns:a="http://schemas.openxmlformats.org/drawingml/2006/main" noChangeAspect="1"/>
+            </wp:cNvGraphicFramePr>
+            <a:graphic xmlns:a="http://schemas.openxmlformats.org/drawingml/2006/main">
+              <a:graphicData uri="http://schemas.openxmlformats.org/drawingml/2006/picture">
+                <pic:pic xmlns:pic="http://schemas.openxmlformats.org/drawingml/2006/picture">
+                  <pic:nvPicPr>
+                    <pic:cNvPr id="872794539" name=""/>
+                    <pic:cNvPicPr/>
+                  </pic:nvPicPr>
+                  <pic:blipFill>
+                    <a:blip r:embed="rId56"/>
+                    <a:stretch>
+                      <a:fillRect/>
+                    </a:stretch>
+                  </pic:blipFill>
+                  <pic:spPr>
+                    <a:xfrm>
+                      <a:off x="0" y="0"/>
+                      <a:ext cx="5731510" cy="4973955"/>
+                    </a:xfrm>
+                    <a:prstGeom prst="rect">
+                      <a:avLst/>
+                    </a:prstGeom>
+                  </pic:spPr>
+                </pic:pic>
+              </a:graphicData>
+            </a:graphic>
+          </wp:inline>
+        </w:drawing>
+      </w:r>
+      <w:r>
+        <w:rPr>
+          <w:b/>
+          <w:bCs/>
+        </w:rPr>
+        <w:br/>
+      </w:r>
+      <w:r>
+        <w:rPr>
+          <w:b/>
+          <w:bCs/>
+        </w:rPr>
+        <w:lastRenderedPageBreak/>
+        <w:drawing>
+          <wp:inline distT="0" distB="0" distL="0" distR="0" wp14:anchorId="6086E38B" wp14:editId="5778032F">
+            <wp:extent cx="5731510" cy="3007995"/>
+            <wp:effectExtent l="0" t="0" r="2540" b="1905"/>
+            <wp:docPr id="838421780" name="Picture 1"/>
+            <wp:cNvGraphicFramePr>
+              <a:graphicFrameLocks xmlns:a="http://schemas.openxmlformats.org/drawingml/2006/main" noChangeAspect="1"/>
+            </wp:cNvGraphicFramePr>
+            <a:graphic xmlns:a="http://schemas.openxmlformats.org/drawingml/2006/main">
+              <a:graphicData uri="http://schemas.openxmlformats.org/drawingml/2006/picture">
+                <pic:pic xmlns:pic="http://schemas.openxmlformats.org/drawingml/2006/picture">
+                  <pic:nvPicPr>
+                    <pic:cNvPr id="838421780" name=""/>
+                    <pic:cNvPicPr/>
+                  </pic:nvPicPr>
+                  <pic:blipFill>
+                    <a:blip r:embed="rId57"/>
+                    <a:stretch>
+                      <a:fillRect/>
+                    </a:stretch>
+                  </pic:blipFill>
+                  <pic:spPr>
+                    <a:xfrm>
+                      <a:off x="0" y="0"/>
+                      <a:ext cx="5731510" cy="3007995"/>
+                    </a:xfrm>
+                    <a:prstGeom prst="rect">
+                      <a:avLst/>
+                    </a:prstGeom>
+                  </pic:spPr>
+                </pic:pic>
+              </a:graphicData>
+            </a:graphic>
+          </wp:inline>
+        </w:drawing>
+      </w:r>
+      <w:r>
+        <w:rPr>
+          <w:b/>
+          <w:bCs/>
+        </w:rPr>
+        <w:br/>
+      </w:r>
+      <w:r>
+        <w:rPr>
+          <w:b/>
+          <w:bCs/>
+        </w:rPr>
+        <w:drawing>
+          <wp:inline distT="0" distB="0" distL="0" distR="0" wp14:anchorId="0C112783" wp14:editId="670E1D8B">
+            <wp:extent cx="5731510" cy="1484630"/>
+            <wp:effectExtent l="0" t="0" r="2540" b="1270"/>
+            <wp:docPr id="860902309" name="Picture 1"/>
+            <wp:cNvGraphicFramePr>
+              <a:graphicFrameLocks xmlns:a="http://schemas.openxmlformats.org/drawingml/2006/main" noChangeAspect="1"/>
+            </wp:cNvGraphicFramePr>
+            <a:graphic xmlns:a="http://schemas.openxmlformats.org/drawingml/2006/main">
+              <a:graphicData uri="http://schemas.openxmlformats.org/drawingml/2006/picture">
+                <pic:pic xmlns:pic="http://schemas.openxmlformats.org/drawingml/2006/picture">
+                  <pic:nvPicPr>
+                    <pic:cNvPr id="860902309" name=""/>
+                    <pic:cNvPicPr/>
+                  </pic:nvPicPr>
+                  <pic:blipFill>
+                    <a:blip r:embed="rId58"/>
+                    <a:stretch>
+                      <a:fillRect/>
+                    </a:stretch>
+                  </pic:blipFill>
+                  <pic:spPr>
+                    <a:xfrm>
+                      <a:off x="0" y="0"/>
+                      <a:ext cx="5731510" cy="1484630"/>
+                    </a:xfrm>
+                    <a:prstGeom prst="rect">
+                      <a:avLst/>
+                    </a:prstGeom>
+                  </pic:spPr>
+                </pic:pic>
+              </a:graphicData>
+            </a:graphic>
+          </wp:inline>
+        </w:drawing>
+      </w:r>
+      <w:r>
+        <w:rPr>
+          <w:b/>
+          <w:bCs/>
+        </w:rPr>
+        <w:br/>
+      </w:r>
+      <w:r>
+        <w:rPr>
+          <w:b/>
+          <w:bCs/>
+        </w:rPr>
+        <w:br/>
+      </w:r>
+      <w:r>
+        <w:rPr>
+          <w:b/>
+          <w:bCs/>
+        </w:rPr>
+        <w:lastRenderedPageBreak/>
+        <w:drawing>
+          <wp:inline distT="0" distB="0" distL="0" distR="0" wp14:anchorId="06544EAE" wp14:editId="7A403A10">
+            <wp:extent cx="5731510" cy="4601845"/>
+            <wp:effectExtent l="0" t="0" r="2540" b="8255"/>
+            <wp:docPr id="38947596" name="Picture 1"/>
+            <wp:cNvGraphicFramePr>
+              <a:graphicFrameLocks xmlns:a="http://schemas.openxmlformats.org/drawingml/2006/main" noChangeAspect="1"/>
+            </wp:cNvGraphicFramePr>
+            <a:graphic xmlns:a="http://schemas.openxmlformats.org/drawingml/2006/main">
+              <a:graphicData uri="http://schemas.openxmlformats.org/drawingml/2006/picture">
+                <pic:pic xmlns:pic="http://schemas.openxmlformats.org/drawingml/2006/picture">
+                  <pic:nvPicPr>
+                    <pic:cNvPr id="38947596" name=""/>
+                    <pic:cNvPicPr/>
+                  </pic:nvPicPr>
+                  <pic:blipFill>
+                    <a:blip r:embed="rId59"/>
+                    <a:stretch>
+                      <a:fillRect/>
+                    </a:stretch>
+                  </pic:blipFill>
+                  <pic:spPr>
+                    <a:xfrm>
+                      <a:off x="0" y="0"/>
+                      <a:ext cx="5731510" cy="4601845"/>
+                    </a:xfrm>
+                    <a:prstGeom prst="rect">
+                      <a:avLst/>
+                    </a:prstGeom>
+                  </pic:spPr>
+                </pic:pic>
+              </a:graphicData>
+            </a:graphic>
+          </wp:inline>
+        </w:drawing>
+      </w:r>
+      <w:r>
+        <w:rPr>
+          <w:b/>
+          <w:bCs/>
+        </w:rPr>
+        <w:br/>
+      </w:r>
+      <w:r>
+        <w:rPr>
+          <w:b/>
+          <w:bCs/>
+        </w:rPr>
+        <w:br/>
+      </w:r>
+      <w:r>
+        <w:rPr>
+          <w:b/>
+          <w:bCs/>
+        </w:rPr>
+        <w:lastRenderedPageBreak/>
+        <w:drawing>
+          <wp:inline distT="0" distB="0" distL="0" distR="0" wp14:anchorId="632955B2" wp14:editId="4E9D1537">
+            <wp:extent cx="5731510" cy="4640580"/>
+            <wp:effectExtent l="0" t="0" r="2540" b="7620"/>
+            <wp:docPr id="1688383191" name="Picture 1"/>
+            <wp:cNvGraphicFramePr>
+              <a:graphicFrameLocks xmlns:a="http://schemas.openxmlformats.org/drawingml/2006/main" noChangeAspect="1"/>
+            </wp:cNvGraphicFramePr>
+            <a:graphic xmlns:a="http://schemas.openxmlformats.org/drawingml/2006/main">
+              <a:graphicData uri="http://schemas.openxmlformats.org/drawingml/2006/picture">
+                <pic:pic xmlns:pic="http://schemas.openxmlformats.org/drawingml/2006/picture">
+                  <pic:nvPicPr>
+                    <pic:cNvPr id="1688383191" name=""/>
+                    <pic:cNvPicPr/>
+                  </pic:nvPicPr>
+                  <pic:blipFill>
+                    <a:blip r:embed="rId60"/>
+                    <a:stretch>
+                      <a:fillRect/>
+                    </a:stretch>
+                  </pic:blipFill>
+                  <pic:spPr>
+                    <a:xfrm>
+                      <a:off x="0" y="0"/>
+                      <a:ext cx="5731510" cy="4640580"/>
+                    </a:xfrm>
+                    <a:prstGeom prst="rect">
+                      <a:avLst/>
+                    </a:prstGeom>
+                  </pic:spPr>
+                </pic:pic>
+              </a:graphicData>
+            </a:graphic>
+          </wp:inline>
+        </w:drawing>
+      </w:r>
+      <w:r>
+        <w:rPr>
+          <w:b/>
+          <w:bCs/>
+        </w:rPr>
+        <w:br/>
+      </w:r>
+      <w:r>
+        <w:rPr>
+          <w:b/>
+          <w:bCs/>
+        </w:rPr>
+        <w:lastRenderedPageBreak/>
+        <w:drawing>
+          <wp:inline distT="0" distB="0" distL="0" distR="0" wp14:anchorId="6611B3D2" wp14:editId="5A4D83A7">
+            <wp:extent cx="5731510" cy="4378325"/>
+            <wp:effectExtent l="0" t="0" r="2540" b="3175"/>
+            <wp:docPr id="118931398" name="Picture 1"/>
+            <wp:cNvGraphicFramePr>
+              <a:graphicFrameLocks xmlns:a="http://schemas.openxmlformats.org/drawingml/2006/main" noChangeAspect="1"/>
+            </wp:cNvGraphicFramePr>
+            <a:graphic xmlns:a="http://schemas.openxmlformats.org/drawingml/2006/main">
+              <a:graphicData uri="http://schemas.openxmlformats.org/drawingml/2006/picture">
+                <pic:pic xmlns:pic="http://schemas.openxmlformats.org/drawingml/2006/picture">
+                  <pic:nvPicPr>
+                    <pic:cNvPr id="118931398" name=""/>
+                    <pic:cNvPicPr/>
+                  </pic:nvPicPr>
+                  <pic:blipFill>
+                    <a:blip r:embed="rId61"/>
+                    <a:stretch>
+                      <a:fillRect/>
+                    </a:stretch>
+                  </pic:blipFill>
+                  <pic:spPr>
+                    <a:xfrm>
+                      <a:off x="0" y="0"/>
+                      <a:ext cx="5731510" cy="4378325"/>
+                    </a:xfrm>
+                    <a:prstGeom prst="rect">
+                      <a:avLst/>
+                    </a:prstGeom>
+                  </pic:spPr>
+                </pic:pic>
+              </a:graphicData>
+            </a:graphic>
+          </wp:inline>
+        </w:drawing>
+      </w:r>
+      <w:r>
+        <w:rPr>
+          <w:b/>
+          <w:bCs/>
+        </w:rPr>
+        <w:br/>
+      </w:r>
+      <w:r>
+        <w:rPr>
+          <w:b/>
+          <w:bCs/>
+        </w:rPr>
+        <w:drawing>
+          <wp:inline distT="0" distB="0" distL="0" distR="0" wp14:anchorId="1F6F4A36" wp14:editId="3353142D">
+            <wp:extent cx="5731510" cy="1156970"/>
+            <wp:effectExtent l="0" t="0" r="2540" b="5080"/>
+            <wp:docPr id="698772874" name="Picture 1"/>
+            <wp:cNvGraphicFramePr>
+              <a:graphicFrameLocks xmlns:a="http://schemas.openxmlformats.org/drawingml/2006/main" noChangeAspect="1"/>
+            </wp:cNvGraphicFramePr>
+            <a:graphic xmlns:a="http://schemas.openxmlformats.org/drawingml/2006/main">
+              <a:graphicData uri="http://schemas.openxmlformats.org/drawingml/2006/picture">
+                <pic:pic xmlns:pic="http://schemas.openxmlformats.org/drawingml/2006/picture">
+                  <pic:nvPicPr>
+                    <pic:cNvPr id="698772874" name=""/>
+                    <pic:cNvPicPr/>
+                  </pic:nvPicPr>
+                  <pic:blipFill>
+                    <a:blip r:embed="rId62"/>
+                    <a:stretch>
+                      <a:fillRect/>
+                    </a:stretch>
+                  </pic:blipFill>
+                  <pic:spPr>
+                    <a:xfrm>
+                      <a:off x="0" y="0"/>
+                      <a:ext cx="5731510" cy="1156970"/>
                     </a:xfrm>
                     <a:prstGeom prst="rect">
                       <a:avLst/>
@@ -2542,7 +3839,7 @@
                     <pic:cNvPicPr/>
                   </pic:nvPicPr>
                   <pic:blipFill>
-                    <a:blip r:embed="rId42"/>
+                    <a:blip r:embed="rId63"/>
                     <a:stretch>
                       <a:fillRect/>
                     </a:stretch>
@@ -2574,6 +3871,54 @@
           <w:b/>
           <w:bCs/>
         </w:rPr>
+        <w:drawing>
+          <wp:inline distT="0" distB="0" distL="0" distR="0" wp14:anchorId="1C1C416B" wp14:editId="5276E4E2">
+            <wp:extent cx="5731510" cy="1416685"/>
+            <wp:effectExtent l="0" t="0" r="2540" b="0"/>
+            <wp:docPr id="1079197931" name="Picture 1"/>
+            <wp:cNvGraphicFramePr>
+              <a:graphicFrameLocks xmlns:a="http://schemas.openxmlformats.org/drawingml/2006/main" noChangeAspect="1"/>
+            </wp:cNvGraphicFramePr>
+            <a:graphic xmlns:a="http://schemas.openxmlformats.org/drawingml/2006/main">
+              <a:graphicData uri="http://schemas.openxmlformats.org/drawingml/2006/picture">
+                <pic:pic xmlns:pic="http://schemas.openxmlformats.org/drawingml/2006/picture">
+                  <pic:nvPicPr>
+                    <pic:cNvPr id="1079197931" name=""/>
+                    <pic:cNvPicPr/>
+                  </pic:nvPicPr>
+                  <pic:blipFill>
+                    <a:blip r:embed="rId64"/>
+                    <a:stretch>
+                      <a:fillRect/>
+                    </a:stretch>
+                  </pic:blipFill>
+                  <pic:spPr>
+                    <a:xfrm>
+                      <a:off x="0" y="0"/>
+                      <a:ext cx="5731510" cy="1416685"/>
+                    </a:xfrm>
+                    <a:prstGeom prst="rect">
+                      <a:avLst/>
+                    </a:prstGeom>
+                  </pic:spPr>
+                </pic:pic>
+              </a:graphicData>
+            </a:graphic>
+          </wp:inline>
+        </w:drawing>
+      </w:r>
+      <w:r>
+        <w:rPr>
+          <w:b/>
+          <w:bCs/>
+        </w:rPr>
+        <w:br/>
+      </w:r>
+      <w:r>
+        <w:rPr>
+          <w:b/>
+          <w:bCs/>
+        </w:rPr>
         <w:br/>
       </w:r>
       <w:r>
@@ -2582,6 +3927,48 @@
           <w:bCs/>
         </w:rPr>
         <w:lastRenderedPageBreak/>
+        <w:drawing>
+          <wp:inline distT="0" distB="0" distL="0" distR="0" wp14:anchorId="4603BC9D" wp14:editId="6636BD73">
+            <wp:extent cx="5731510" cy="5066665"/>
+            <wp:effectExtent l="0" t="0" r="2540" b="635"/>
+            <wp:docPr id="1442025450" name="Picture 1"/>
+            <wp:cNvGraphicFramePr>
+              <a:graphicFrameLocks xmlns:a="http://schemas.openxmlformats.org/drawingml/2006/main" noChangeAspect="1"/>
+            </wp:cNvGraphicFramePr>
+            <a:graphic xmlns:a="http://schemas.openxmlformats.org/drawingml/2006/main">
+              <a:graphicData uri="http://schemas.openxmlformats.org/drawingml/2006/picture">
+                <pic:pic xmlns:pic="http://schemas.openxmlformats.org/drawingml/2006/picture">
+                  <pic:nvPicPr>
+                    <pic:cNvPr id="1442025450" name=""/>
+                    <pic:cNvPicPr/>
+                  </pic:nvPicPr>
+                  <pic:blipFill>
+                    <a:blip r:embed="rId65"/>
+                    <a:stretch>
+                      <a:fillRect/>
+                    </a:stretch>
+                  </pic:blipFill>
+                  <pic:spPr>
+                    <a:xfrm>
+                      <a:off x="0" y="0"/>
+                      <a:ext cx="5731510" cy="5066665"/>
+                    </a:xfrm>
+                    <a:prstGeom prst="rect">
+                      <a:avLst/>
+                    </a:prstGeom>
+                  </pic:spPr>
+                </pic:pic>
+              </a:graphicData>
+            </a:graphic>
+          </wp:inline>
+        </w:drawing>
+      </w:r>
+      <w:r>
+        <w:rPr>
+          <w:b/>
+          <w:bCs/>
+        </w:rPr>
+        <w:br/>
         <w:t>Reverse words</w:t>
       </w:r>
       <w:r>
@@ -2589,55 +3976,78 @@
           <w:b/>
           <w:bCs/>
         </w:rPr>
-        <w:t xml:space="preserve"> order and reverse each word in String .</w:t>
-      </w:r>
-      <w:r>
-        <w:rPr>
-          <w:b/>
-          <w:bCs/>
-        </w:rPr>
-        <w:br/>
-      </w:r>
-      <w:r>
-        <w:rPr>
-          <w:b/>
-          <w:bCs/>
-        </w:rPr>
-        <w:drawing>
-          <wp:inline distT="0" distB="0" distL="0" distR="0" wp14:anchorId="7D33A5D7" wp14:editId="68560C37">
-            <wp:extent cx="5731510" cy="2316480"/>
-            <wp:effectExtent l="0" t="0" r="2540" b="7620"/>
-            <wp:docPr id="1549610754" name="Picture 1"/>
-            <wp:cNvGraphicFramePr>
-              <a:graphicFrameLocks xmlns:a="http://schemas.openxmlformats.org/drawingml/2006/main" noChangeAspect="1"/>
-            </wp:cNvGraphicFramePr>
-            <a:graphic xmlns:a="http://schemas.openxmlformats.org/drawingml/2006/main">
-              <a:graphicData uri="http://schemas.openxmlformats.org/drawingml/2006/picture">
-                <pic:pic xmlns:pic="http://schemas.openxmlformats.org/drawingml/2006/picture">
-                  <pic:nvPicPr>
-                    <pic:cNvPr id="1549610754" name=""/>
-                    <pic:cNvPicPr/>
-                  </pic:nvPicPr>
-                  <pic:blipFill>
-                    <a:blip r:embed="rId43"/>
-                    <a:stretch>
-                      <a:fillRect/>
-                    </a:stretch>
-                  </pic:blipFill>
-                  <pic:spPr>
-                    <a:xfrm>
-                      <a:off x="0" y="0"/>
-                      <a:ext cx="5731510" cy="2316480"/>
-                    </a:xfrm>
-                    <a:prstGeom prst="rect">
-                      <a:avLst/>
-                    </a:prstGeom>
-                  </pic:spPr>
-                </pic:pic>
-              </a:graphicData>
-            </a:graphic>
-          </wp:inline>
-        </w:drawing>
+        <w:t xml:space="preserve"> order and reverse each word in </w:t>
+      </w:r>
+      <w:proofErr w:type="gramStart"/>
+      <w:r>
+        <w:rPr>
+          <w:b/>
+          <w:bCs/>
+        </w:rPr>
+        <w:t>String .</w:t>
+      </w:r>
+      <w:proofErr w:type="gramEnd"/>
+      <w:r>
+        <w:rPr>
+          <w:b/>
+          <w:bCs/>
+        </w:rPr>
+        <w:br/>
+      </w:r>
+      <w:r>
+        <w:rPr>
+          <w:b/>
+          <w:bCs/>
+        </w:rPr>
+        <w:br/>
+      </w:r>
+      <w:r>
+        <w:rPr>
+          <w:b/>
+          <w:bCs/>
+        </w:rPr>
+        <w:drawing>
+          <wp:inline distT="0" distB="0" distL="0" distR="0" wp14:anchorId="30CE45FA" wp14:editId="7ED33E4F">
+            <wp:extent cx="5731510" cy="2401570"/>
+            <wp:effectExtent l="0" t="0" r="2540" b="0"/>
+            <wp:docPr id="1578790171" name="Picture 1"/>
+            <wp:cNvGraphicFramePr>
+              <a:graphicFrameLocks xmlns:a="http://schemas.openxmlformats.org/drawingml/2006/main" noChangeAspect="1"/>
+            </wp:cNvGraphicFramePr>
+            <a:graphic xmlns:a="http://schemas.openxmlformats.org/drawingml/2006/main">
+              <a:graphicData uri="http://schemas.openxmlformats.org/drawingml/2006/picture">
+                <pic:pic xmlns:pic="http://schemas.openxmlformats.org/drawingml/2006/picture">
+                  <pic:nvPicPr>
+                    <pic:cNvPr id="1578790171" name=""/>
+                    <pic:cNvPicPr/>
+                  </pic:nvPicPr>
+                  <pic:blipFill>
+                    <a:blip r:embed="rId66"/>
+                    <a:stretch>
+                      <a:fillRect/>
+                    </a:stretch>
+                  </pic:blipFill>
+                  <pic:spPr>
+                    <a:xfrm>
+                      <a:off x="0" y="0"/>
+                      <a:ext cx="5731510" cy="2401570"/>
+                    </a:xfrm>
+                    <a:prstGeom prst="rect">
+                      <a:avLst/>
+                    </a:prstGeom>
+                  </pic:spPr>
+                </pic:pic>
+              </a:graphicData>
+            </a:graphic>
+          </wp:inline>
+        </w:drawing>
+      </w:r>
+      <w:r>
+        <w:rPr>
+          <w:b/>
+          <w:bCs/>
+        </w:rPr>
+        <w:br/>
       </w:r>
     </w:p>
     <w:p>
@@ -2654,20 +4064,30 @@
           <w:bCs/>
         </w:rPr>
         <w:br/>
+      </w:r>
+      <w:proofErr w:type="gramStart"/>
+      <w:r>
+        <w:rPr>
+          <w:b/>
+          <w:bCs/>
+        </w:rPr>
         <w:t>Output :</w:t>
       </w:r>
-      <w:r>
-        <w:rPr>
-          <w:b/>
-          <w:bCs/>
-        </w:rPr>
-        <w:br/>
-      </w:r>
-      <w:r>
-        <w:rPr>
-          <w:b/>
-          <w:bCs/>
-        </w:rPr>
+      <w:proofErr w:type="gramEnd"/>
+      <w:r>
+        <w:rPr>
+          <w:b/>
+          <w:bCs/>
+        </w:rPr>
+        <w:br/>
+      </w:r>
+      <w:r>
+        <w:rPr>
+          <w:b/>
+          <w:bCs/>
+          <w:noProof/>
+        </w:rPr>
+        <w:lastRenderedPageBreak/>
         <w:drawing>
           <wp:inline distT="0" distB="0" distL="0" distR="0" wp14:anchorId="3FC02313" wp14:editId="490E5476">
             <wp:extent cx="4801270" cy="971686"/>
@@ -2684,7 +4104,7 @@
                     <pic:cNvPicPr/>
                   </pic:nvPicPr>
                   <pic:blipFill>
-                    <a:blip r:embed="rId44"/>
+                    <a:blip r:embed="rId67"/>
                     <a:stretch>
                       <a:fillRect/>
                     </a:stretch>
@@ -2703,6 +4123,72 @@
             </a:graphic>
           </wp:inline>
         </w:drawing>
+      </w:r>
+      <w:r>
+        <w:rPr>
+          <w:b/>
+          <w:bCs/>
+        </w:rPr>
+        <w:br/>
+      </w:r>
+      <w:r>
+        <w:rPr>
+          <w:b/>
+          <w:bCs/>
+        </w:rPr>
+        <w:br/>
+      </w:r>
+      <w:r>
+        <w:rPr>
+          <w:b/>
+          <w:bCs/>
+        </w:rPr>
+        <w:br/>
+        <w:t xml:space="preserve">Map and </w:t>
+      </w:r>
+      <w:proofErr w:type="spellStart"/>
+      <w:r>
+        <w:rPr>
+          <w:b/>
+          <w:bCs/>
+        </w:rPr>
+        <w:t>Flat</w:t>
+      </w:r>
+      <w:r>
+        <w:rPr>
+          <w:b/>
+          <w:bCs/>
+        </w:rPr>
+        <w:t>Map</w:t>
+      </w:r>
+      <w:proofErr w:type="spellEnd"/>
+      <w:r>
+        <w:rPr>
+          <w:b/>
+          <w:bCs/>
+        </w:rPr>
+        <w:t xml:space="preserve"> </w:t>
+      </w:r>
+      <w:r>
+        <w:rPr>
+          <w:b/>
+          <w:bCs/>
+        </w:rPr>
+        <w:sym w:font="Wingdings" w:char="F0E0"/>
+      </w:r>
+      <w:r>
+        <w:rPr>
+          <w:b/>
+          <w:bCs/>
+        </w:rPr>
+        <w:t xml:space="preserve"> Coding Questions</w:t>
+      </w:r>
+      <w:r>
+        <w:rPr>
+          <w:b/>
+          <w:bCs/>
+        </w:rPr>
+        <w:br/>
       </w:r>
       <w:r>
         <w:rPr>

</xml_diff>